<commit_message>
Updated Cesare's affiliation + added new Anna to the schedule
</commit_message>
<xml_diff>
--- a/assets/abstracts/Flyer_seminar105.docx
+++ b/assets/abstracts/Flyer_seminar105.docx
@@ -1218,33 +1218,45 @@
           <w:sz w:val="24"/>
           <w:szCs w:val="24"/>
         </w:rPr>
-        <w:t>School of Mathematics and Physics, University of Surrey, Guildford, UK</w:t>
-      </w:r>
-      <w:r>
-        <w:rPr>
-          <w:rFonts w:ascii="Times New Roman" w:eastAsia="Times New Roman" w:hAnsi="Times New Roman"/>
-          <w:b/>
-          <w:bCs/>
+        <w:t>School of Mathematics and Physics, University of Surrey, Guildford, United Kingdom</w:t>
+      </w:r>
+    </w:p>
+    <w:p>
+      <w:pPr>
+        <w:jc w:val="center"/>
+        <w:rPr>
+          <w:rFonts w:ascii="Times New Roman" w:eastAsia="Times New Roman" w:hAnsi="Times New Roman"/>
           <w:i/>
           <w:iCs/>
           <w:kern w:val="0"/>
           <w:sz w:val="24"/>
           <w:szCs w:val="24"/>
         </w:rPr>
-        <w:t xml:space="preserve"> </w:t>
-      </w:r>
-      <w:r>
-        <w:rPr>
-          <w:rFonts w:ascii="Times New Roman" w:eastAsia="Times New Roman" w:hAnsi="Times New Roman"/>
-          <w:b/>
-          <w:bCs/>
-          <w:color w:val="0070C0"/>
-          <w:kern w:val="0"/>
-          <w:sz w:val="28"/>
-          <w:szCs w:val="28"/>
-        </w:rPr>
-        <w:br/>
-      </w:r>
+      </w:pPr>
+      <w:r>
+        <w:rPr>
+          <w:rFonts w:ascii="Times New Roman" w:eastAsia="Times New Roman" w:hAnsi="Times New Roman"/>
+          <w:i/>
+          <w:iCs/>
+          <w:kern w:val="0"/>
+          <w:sz w:val="24"/>
+          <w:szCs w:val="24"/>
+        </w:rPr>
+        <w:t>School of Physical and Mathematical Sciences, Nanyang Technological University, Singapore</w:t>
+      </w:r>
+    </w:p>
+    <w:p>
+      <w:pPr>
+        <w:jc w:val="center"/>
+        <w:rPr>
+          <w:rFonts w:ascii="Times New Roman" w:eastAsia="Times New Roman" w:hAnsi="Times New Roman"/>
+          <w:i/>
+          <w:iCs/>
+          <w:kern w:val="0"/>
+          <w:sz w:val="24"/>
+          <w:szCs w:val="24"/>
+        </w:rPr>
+      </w:pPr>
       <w:r>
         <w:rPr>
           <w:rFonts w:ascii="Times New Roman" w:eastAsia="Times New Roman" w:hAnsi="Times New Roman"/>
@@ -1323,6 +1335,7 @@
           <w:rFonts w:ascii="Times New Roman" w:eastAsia="Times New Roman" w:hAnsi="Times New Roman"/>
           <w:b/>
           <w:bCs/>
+          <w:noProof/>
           <w:color w:val="0070C0"/>
           <w:kern w:val="0"/>
           <w:sz w:val="28"/>
@@ -1585,20 +1598,6 @@
           <w:szCs w:val="28"/>
         </w:rPr>
       </w:pPr>
-    </w:p>
-    <w:p>
-      <w:pPr>
-        <w:jc w:val="center"/>
-        <w:rPr>
-          <w:rFonts w:ascii="Times New Roman" w:eastAsia="Times New Roman" w:hAnsi="Times New Roman"/>
-          <w:b/>
-          <w:bCs/>
-          <w:color w:val="0070C0"/>
-          <w:kern w:val="0"/>
-          <w:sz w:val="28"/>
-          <w:szCs w:val="28"/>
-        </w:rPr>
-      </w:pPr>
       <w:r>
         <w:rPr>
           <w:rFonts w:ascii="Times New Roman" w:eastAsia="Times New Roman" w:hAnsi="Times New Roman"/>
@@ -1886,18 +1885,7 @@
           <w:sz w:val="24"/>
           <w:szCs w:val="24"/>
         </w:rPr>
-        <w:t>Corresponding Author:</w:t>
-      </w:r>
-      <w:r>
-        <w:rPr>
-          <w:rFonts w:ascii="Times New Roman" w:eastAsia="Times New Roman" w:hAnsi="Times New Roman"/>
-          <w:i/>
-          <w:iCs/>
-          <w:kern w:val="0"/>
-          <w:sz w:val="24"/>
-          <w:szCs w:val="24"/>
-        </w:rPr>
-        <w:t xml:space="preserve"> </w:t>
+        <w:t xml:space="preserve">Corresponding Author: </w:t>
       </w:r>
       <w:hyperlink r:id="rId11" w:history="1">
         <w:r>
@@ -1944,6 +1932,7 @@
       <w:r>
         <w:rPr>
           <w:rFonts w:ascii="Times New Roman" w:eastAsia="Times New Roman" w:hAnsi="Times New Roman"/>
+          <w:noProof/>
           <w:kern w:val="0"/>
           <w:sz w:val="24"/>
           <w:szCs w:val="24"/>

</xml_diff>